<commit_message>
Clarify three-part course structure: lecture, practice lesson, lab (homework)
- Distinguish the in-class instructor-led practice lesson (live implementations,
  code runs, worked examples) from the lab, which is the student's homework
- Added per-week instructor practice-lesson content; lesson plans now show
  instructor demonstrations in the 2h practice block (not the lab exercise)
- Reframed labs as homework throughout (labs, notebooks, syllabus, README)
- Rephrased exercise -> lab consistently; syllabus Course Format now states the
  three parts; HIT package (EN + HE) course-of-lessons and grade wording aligned
- Fixed an uppercase CLAUDE the earlier pass missed; regenerated all artifacts
  and re-exported syllabus.pdf

Co-Authored-By: Claude Opus 4.8 <noreply@anthropic.com>
</commit_message>
<xml_diff>
--- a/hit-catalogue/syllabus_en.docx
+++ b/hit-catalogue/syllabus_en.docx
@@ -125,7 +125,7 @@
           <w:b w:val="0"/>
           <w:sz w:val="22"/>
         </w:rPr>
-        <w:t>The course begins with the building blocks: tensors and data representation, the multilayer perceptron, and backpropagation with automatic differentiation. It then covers the training stack: data pipelines, loss functions and metrics, optimization (SGD, Adam), and regularization. The second half studies the core architecture families: convolutional networks (including normalization and residual connections), recurrent networks (RNNs, LSTMs, and GRUs), and representation learning with autoencoders and contrastive methods. The course concludes with transfer learning and an end-to-end workflow. It is highly practical, taught in PyTorch with weekly hands-on exercises, and designed for working with an AI coding assistant.</w:t>
+        <w:t>The course begins with the building blocks: tensors and data representation, the multilayer perceptron, and backpropagation with automatic differentiation. It then covers the training stack: data pipelines, loss functions and metrics, optimization (SGD, Adam), and regularization. The second half studies the core architecture families: convolutional networks (including normalization and residual connections), recurrent networks (RNNs, LSTMs, and GRUs), and representation learning with autoencoders and contrastive methods. The course concludes with transfer learning and an end-to-end workflow. It is highly practical, taught in PyTorch with weekly hands-on labs, and designed for working with an AI coding assistant.</w:t>
       </w:r>
     </w:p>
     <w:p>
@@ -153,7 +153,7 @@
           <w:b w:val="0"/>
           <w:sz w:val="22"/>
         </w:rPr>
-        <w:t>The course is project- and exercise-based with no written exams. The final grade combines weekly hands-on exercises (40%), a mid-term mini-project (20%), a final project with a short oral defense (35%), and participation (5%).</w:t>
+        <w:t>The course is project- and lab-based with no written exams. The final grade combines weekly labs (40%), a mid-term mini-project (20%), a final project with a short oral defense (35%), and participation (5%).</w:t>
       </w:r>
     </w:p>
     <w:p>
@@ -181,7 +181,7 @@
           <w:b w:val="0"/>
           <w:sz w:val="22"/>
         </w:rPr>
-        <w:t>Each week combines a 3-hour lecture (slides, worked examples, and live code demonstrations) with a 2-hour practice lab in which students implement and experiment. Exercises follow a build, predict, and explain model: students may use an AI assistant for the build, but the graded work is predicting outcomes and explaining results.</w:t>
+        <w:t>Each week has three parts: a 3-hour lecture that develops the theory, a 2-hour practice lesson in which the instructor demonstrates implementations and works through examples, and a weekly lab set as homework. The labs follow a build, predict, and explain model: students may use an AI assistant for the build, but the graded work is predicting outcomes and explaining results.</w:t>
       </w:r>
     </w:p>
     <w:p>

</xml_diff>

<commit_message>
Deepen practice notebooks; format HE/EN syllabus section titles as real headers
Practice notebooks: replace the thin per-demo code list with a sectioned
NB structure (8-12 cells/week) of worked demonstrations, explanatory
markdown, plots, and "try it live" prompts to fill the 2-hour practice
lesson. All synthetic-data weeks (1-7, 9-11) smoke-tested end-to-end on
PyTorch 2.10; fixed a variable-clobber bug in week 3 (the hand-derived
gradient cell reassigned the label tensor used by the later training cell).

HIT package: section headings in syllabus_he/syllabus_en now use the
example's Heading 1 style (Arial bold 16pt, accent blue 365F91, outline
level), so they read as proper headers instead of inline bold text.
RTL headings right-aligned, LTR headings left-aligned; render-verified
both against the example.

Co-Authored-By: Claude Opus 4.8 <noreply@anthropic.com>
</commit_message>
<xml_diff>
--- a/hit-catalogue/syllabus_en.docx
+++ b/hit-catalogue/syllabus_en.docx
@@ -64,14 +64,18 @@
     </w:p>
     <w:p>
       <w:pPr>
+        <w:pStyle w:val="Heading1"/>
         <w:bidi w:val="0"/>
-        <w:spacing w:after="80"/>
+        <w:spacing w:before="200" w:after="80"/>
+        <w:outlineLvl w:val="0"/>
+        <w:keepNext/>
       </w:pPr>
       <w:r>
         <w:rPr>
           <w:rFonts w:ascii="Arial" w:hAnsi="Arial" w:cs="Arial"/>
           <w:b/>
-          <w:sz w:val="26"/>
+          <w:color w:val="365F91"/>
+          <w:sz w:val="32"/>
         </w:rPr>
         <w:t>Course Objectives</w:t>
       </w:r>
@@ -108,14 +112,18 @@
     </w:p>
     <w:p>
       <w:pPr>
+        <w:pStyle w:val="Heading1"/>
         <w:bidi w:val="0"/>
-        <w:spacing w:after="80"/>
+        <w:spacing w:before="200" w:after="80"/>
+        <w:outlineLvl w:val="0"/>
+        <w:keepNext/>
       </w:pPr>
       <w:r>
         <w:rPr>
           <w:rFonts w:ascii="Arial" w:hAnsi="Arial" w:cs="Arial"/>
           <w:b/>
-          <w:sz w:val="26"/>
+          <w:color w:val="365F91"/>
+          <w:sz w:val="32"/>
         </w:rPr>
         <w:t>Course content</w:t>
       </w:r>
@@ -137,14 +145,18 @@
     </w:p>
     <w:p>
       <w:pPr>
+        <w:pStyle w:val="Heading1"/>
         <w:bidi w:val="0"/>
-        <w:spacing w:after="80"/>
+        <w:spacing w:before="200" w:after="80"/>
+        <w:outlineLvl w:val="0"/>
+        <w:keepNext/>
       </w:pPr>
       <w:r>
         <w:rPr>
           <w:rFonts w:ascii="Arial" w:hAnsi="Arial" w:cs="Arial"/>
           <w:b/>
-          <w:sz w:val="26"/>
+          <w:color w:val="365F91"/>
+          <w:sz w:val="32"/>
         </w:rPr>
         <w:t>Student duties and grade components</w:t>
       </w:r>
@@ -166,14 +178,18 @@
     </w:p>
     <w:p>
       <w:pPr>
+        <w:pStyle w:val="Heading1"/>
         <w:bidi w:val="0"/>
-        <w:spacing w:after="80"/>
+        <w:spacing w:before="200" w:after="80"/>
+        <w:outlineLvl w:val="0"/>
+        <w:keepNext/>
       </w:pPr>
       <w:r>
         <w:rPr>
           <w:rFonts w:ascii="Arial" w:hAnsi="Arial" w:cs="Arial"/>
           <w:b/>
-          <w:sz w:val="26"/>
+          <w:color w:val="365F91"/>
+          <w:sz w:val="32"/>
         </w:rPr>
         <w:t>Course of lessons</w:t>
       </w:r>
@@ -726,14 +742,18 @@
     </w:p>
     <w:p>
       <w:pPr>
+        <w:pStyle w:val="Heading1"/>
         <w:bidi w:val="0"/>
-        <w:spacing w:after="80"/>
+        <w:spacing w:before="200" w:after="80"/>
+        <w:outlineLvl w:val="0"/>
+        <w:keepNext/>
       </w:pPr>
       <w:r>
         <w:rPr>
           <w:rFonts w:ascii="Arial" w:hAnsi="Arial" w:cs="Arial"/>
           <w:b/>
-          <w:sz w:val="26"/>
+          <w:color w:val="365F91"/>
+          <w:sz w:val="32"/>
         </w:rPr>
         <w:t>Textbooks</w:t>
       </w:r>

</xml_diff>

<commit_message>
Validate syllabus bibliography; correct two author attributions
Web-validated all five textbook citations against publisher catalogs (MIT
Press, Cambridge University Press, Packt, Manning) and the books' official
sites. All five are real and correctly attributed (Goodfellow et al. 2016;
Prince 2023; Zhang et al., Cambridge UP 2023; Raschka et al. Packt 2022;
Chollet 2nd ed. Manning 2021). The three online book URLs in refs.json are
live and point to the claimed chapters.

Two attribution refinements to match canonical credit:
- Raschka et al.: third author is credited as "Yuxi (Hayden) Liu".
- Chollet: correct cedilla, "François".

(Used web verification against publisher catalogs rather than bibtest, which
is paper/Crossref-centric and does not reliably index textbooks.)

Co-Authored-By: Claude Opus 4.8 <noreply@anthropic.com>
</commit_message>
<xml_diff>
--- a/hit-catalogue/syllabus_en.docx
+++ b/hit-catalogue/syllabus_en.docx
@@ -854,7 +854,7 @@
           <w:b w:val="0"/>
           <w:sz w:val="22"/>
         </w:rPr>
-        <w:t>Raschka, Sebastian, Yuxi Liu, and Vahid Mirjalili. Machine Learning with PyTorch and Scikit-Learn. Packt Publishing, 2022.</w:t>
+        <w:t>Raschka, Sebastian, Yuxi (Hayden) Liu, and Vahid Mirjalili. Machine Learning with PyTorch and Scikit-Learn. Packt Publishing, 2022.</w:t>
       </w:r>
     </w:p>
     <w:p>
@@ -869,7 +869,7 @@
           <w:b w:val="0"/>
           <w:sz w:val="22"/>
         </w:rPr>
-        <w:t>Chollet, Francois. Deep Learning with Python. 2nd ed. Manning, 2021.</w:t>
+        <w:t>Chollet, François. Deep Learning with Python. 2nd ed. Manning, 2021.</w:t>
       </w:r>
     </w:p>
     <w:sectPr>

</xml_diff>